<commit_message>
Evaristo Costa: revisão da parte 4
Co-Authored-By: Claude Opus 5.5 <noreply@anthropic.com>
Claude-Session: https://claude.ai/code/session_01MJjUEEZrxQDEUifKK2vj9g
</commit_message>
<xml_diff>
--- a/roteiros/evaristo-costa/EvaristoCosta_Parte4.docx
+++ b/roteiros/evaristo-costa/EvaristoCosta_Parte4.docx
@@ -63,7 +63,7 @@
         <w:rPr>
           <w:color w:val="000000"/>
         </w:rPr>
-        <w:t>Quando Evaristo descobriu, pela própria programação da CNN, que o programa dele tinha sumido da grade, ele já convivia com a doença de Crohn havia mais de um ano. Estava de férias. E já sabia que tinha uma doença sem cura.</w:t>
+        <w:t>Quando Evaristo descobriu, pela própria programação da CNN, que o programa dele tinha sumido da grade, ele já convivia com a doença de Crohn havia mais de um ano. Estava de férias.</w:t>
       </w:r>
     </w:p>
     <w:p>
@@ -79,7 +79,7 @@
         <w:rPr>
           <w:color w:val="000000"/>
         </w:rPr>
-        <w:t>Evaristo tinha acabado de descobrir que ia conviver para sempre com uma doença sem cura. E, no meio disso, perdeu o emprego pela tela da televisão, com mais de um ano de contrato pela frente. Para um homem que já não tinha controle sobre o próprio corpo, perder também o controle sobre o próprio trabalho foi um golpe duplo.</w:t>
+        <w:t>Perdeu o emprego pela tela da televisão, com mais de um ano de contrato pela frente, enquanto aprendia a conviver com uma doença para a vida inteira. Para um homem que já não tinha controle sobre o próprio corpo, perder também o controle sobre o próprio trabalho foi um golpe duplo.</w:t>
       </w:r>
     </w:p>
     <w:p>
@@ -87,7 +87,7 @@
         <w:rPr>
           <w:color w:val="C00000"/>
         </w:rPr>
-        <w:t>Repare no que isso muda. A demissão pela TV, que já parecia humilhante, ganha outro peso quando você sabe o que ele carregava por dentro. Mas os anos seguintes iam mostrar que a CNN foi apenas o começo de uma sequência de golpes.</w:t>
+        <w:t>Mas o que veio depois foi pior. A CNN foi apenas o primeiro de uma sequência de golpes. E os próximos iam atingir o corpo dele diretamente.</w:t>
       </w:r>
     </w:p>
     <w:p>
@@ -143,7 +143,7 @@
         <w:rPr>
           <w:color w:val="000000"/>
         </w:rPr>
-        <w:t>Evaristo estava no Brasil, a trabalho. E a perna esquerda começou a mudar. Ficou vermelha e inchada.</w:t>
+        <w:t>Evaristo estava no Brasil. E a perna esquerda começou a mudar. Ficou vermelha e inchada.</w:t>
       </w:r>
     </w:p>
     <w:p>
@@ -151,7 +151,7 @@
         <w:rPr>
           <w:color w:val="000000"/>
         </w:rPr>
-        <w:t>Era uma infecção na pele. Os médicos falaram em erisipela e celulite, dois tipos de infecção que atacam a pele e os tecidos logo abaixo dela. O próprio Evaristo explicou aos seguidores: "Erisipela e celulite são dois tipos de infecção na pele. As duas causam vermelhidão, dor e inchaço."</w:t>
+        <w:t>Era uma infecção na pele. O próprio Evaristo explicou aos seguidores: "Erisipela e celulite são dois tipos de infecção na pele. As duas causam vermelhidão, dor e inchaço."</w:t>
       </w:r>
     </w:p>
     <w:p>
@@ -175,7 +175,7 @@
         <w:rPr>
           <w:color w:val="000000"/>
         </w:rPr>
-        <w:t>O tratamento precisava ser mais forte. Ele contou: "Para melhor absorção do antibiótico pelo meu corpo, o melhor é direto na veia."</w:t>
+        <w:t>Por causa da imunidade baixa, o antibiótico precisava chegar ao corpo do jeito mais eficiente. Ele contou: "Para melhor absorção do antibiótico pelo meu corpo, o melhor é direto na veia."</w:t>
       </w:r>
     </w:p>
     <w:p>
@@ -183,7 +183,7 @@
         <w:rPr>
           <w:color w:val="000000"/>
         </w:rPr>
-        <w:t>Esse é o quarto objeto dessa história. A bolsa de antibiótico pendurada ao lado da cama, com o tubo descendo até o braço dele.</w:t>
+        <w:t>Esse é o quarto objeto dessa história. A bolsa de antibiótico pendurada ao lado da cama, com o tubo descendo até a veia.</w:t>
       </w:r>
     </w:p>
     <w:p>
@@ -223,7 +223,7 @@
         <w:rPr>
           <w:color w:val="000000"/>
         </w:rPr>
-        <w:t>Durante anos, Evaristo tinha escolhido viver entre dois países. Trabalhava no Brasil e voltava para casa na Inglaterra. Aquela liberdade de atravessar o oceano quando quisesse era uma das coisas que ele mais valorizava na vida nova. Agora, uma infecção na perna decidia por ele onde ele podia ficar.</w:t>
+        <w:t>Durante anos, Evaristo tinha escolhido viver entre dois países. Trabalhava no Brasil e voltava para casa na Inglaterra. Aquela liberdade de atravessar o oceano quando quisesse fazia parte da vida que ele tinha escolhido. Agora, uma infecção na perna decidia por ele onde ele podia ficar.</w:t>
       </w:r>
     </w:p>
     <w:p>
@@ -279,14 +279,6 @@
         <w:rPr>
           <w:color w:val="000000"/>
         </w:rPr>
-        <w:t>A febre não cedia.</w:t>
-      </w:r>
-    </w:p>
-    <w:p>
-      <w:r>
-        <w:rPr>
-          <w:color w:val="000000"/>
-        </w:rPr>
         <w:t>Na sexta-feira, doze de janeiro, Evaristo deu entrada num hospital em Cambridge.</w:t>
       </w:r>
     </w:p>
@@ -335,14 +327,6 @@
         <w:rPr>
           <w:color w:val="1F4EB4"/>
         </w:rPr>
-        <w:t>Os médicos fizeram exame atrás de exame. Os resultados eram comparados, discutidos, refeitos.</w:t>
-      </w:r>
-    </w:p>
-    <w:p>
-      <w:r>
-        <w:rPr>
-          <w:color w:val="1F4EB4"/>
-        </w:rPr>
         <w:t>Evaristo, mesmo ali, tentou manter o humor. Escreveu que estava liberado para circular "pelo hotel, digo, hospital".</w:t>
       </w:r>
     </w:p>
@@ -367,7 +351,7 @@
         <w:rPr>
           <w:color w:val="1F4EB4"/>
         </w:rPr>
-        <w:t>Foi deitado naquela cama, com o antibiótico entrando na veia, que Evaristo decidiu contar ao Brasil a história do diagnóstico errado. O ano inteiro tratando gastrite. A dor que descia. As idas ao banheiro, quinze, vinte, trinta vezes por dia.</w:t>
+        <w:t>Foi deitado naquela cama, com o antibiótico entrando na veia, que Evaristo decidiu contar ao Brasil a história do diagnóstico errado. O ano inteiro tratando a doença errada.</w:t>
       </w:r>
     </w:p>
     <w:p>
@@ -375,7 +359,7 @@
         <w:rPr>
           <w:color w:val="1F4EB4"/>
         </w:rPr>
-        <w:t>O homem que o país conhecia sorrindo na hora do almoço estava, pela primeira vez, mostrando a parte mais dura da própria vida.</w:t>
+        <w:t>O homem que o país conhecia sorrindo na hora do almoço estava mostrando, de uma cama de UTI, a parte mais dura da própria vida.</w:t>
       </w:r>
     </w:p>
     <w:p>
@@ -415,7 +399,7 @@
         <w:rPr>
           <w:color w:val="1F4EB4"/>
         </w:rPr>
-        <w:t>Para controlar a inflamação no intestino, os médicos recorreram ao corticoide. Um remédio forte, que costuma ajudar em crises como a dele.</w:t>
+        <w:t>Ao longo do tratamento, para controlar a inflamação no intestino, os médicos recorreram ao corticoide. Um remédio forte, que costuma ajudar em crises como a dele.</w:t>
       </w:r>
     </w:p>
     <w:p>
@@ -527,7 +511,7 @@
         <w:rPr>
           <w:color w:val="C00000"/>
         </w:rPr>
-        <w:t>Foi aí que a internet começou a fazer a pergunta mais dura de todas. Nos comentários, nos vídeos, nas manchetes sensacionalistas. Evaristo Costa está morrendo? E a resposta que ele deu ao Brasil vai mudar o jeito como você enxerga toda essa história.</w:t>
+        <w:t>Foi aí que a internet começou a fazer a pergunta mais dura de todas. Nos comentários e nas manchetes sensacionalistas. Evaristo Costa está morrendo? E a resposta que ele deu ao Brasil vai mudar o jeito como você enxerga toda essa história.</w:t>
       </w:r>
     </w:p>
     <w:sectPr>

</xml_diff>